<commit_message>
added overview and insights to lab journal
</commit_message>
<xml_diff>
--- a/Lab 12 - Introduction to Julia ETL Processes and Data Visualization.docx
+++ b/Lab 12 - Introduction to Julia ETL Processes and Data Visualization.docx
@@ -21,26 +21,65 @@
     </w:p>
     <w:p>
       <w:pPr>
-        <w:rPr/>
-      </w:pPr>
-      <w:r>
-        <w:rPr>
-          <w:rtl w:val="0"/>
-        </w:rPr>
-        <w:t xml:space="preserve">Karl Isele</w:t>
-      </w:r>
-    </w:p>
-    <w:p>
-      <w:pPr>
         <w:pStyle w:val="Heading1"/>
         <w:rPr/>
       </w:pPr>
-      <w:bookmarkStart w:colFirst="0" w:colLast="0" w:name="_veuzkv78pm18" w:id="1"/>
+      <w:bookmarkStart w:colFirst="0" w:colLast="0" w:name="_x0dyas6e9wy5" w:id="1"/>
       <w:bookmarkEnd w:id="1"/>
       <w:r>
         <w:rPr>
           <w:rtl w:val="0"/>
         </w:rPr>
+        <w:t xml:space="preserve">Integrated Dataset</w:t>
+      </w:r>
+    </w:p>
+    <w:p>
+      <w:pPr>
+        <w:rPr/>
+      </w:pPr>
+      <w:r>
+        <w:rPr>
+          <w:rtl w:val="0"/>
+        </w:rPr>
+        <w:t xml:space="preserve">The integrated dataset includes normalized numerical features and three additional features representing the year, month and quarter categories of each data point. This allows for calculating statistics by these time categories and viewing all the numerical features side-by-side as time series.</w:t>
+      </w:r>
+    </w:p>
+    <w:p>
+      <w:pPr>
+        <w:pStyle w:val="Heading1"/>
+        <w:rPr/>
+      </w:pPr>
+      <w:bookmarkStart w:colFirst="0" w:colLast="0" w:name="_ob5x7b2bdywh" w:id="2"/>
+      <w:bookmarkEnd w:id="2"/>
+      <w:r>
+        <w:rPr>
+          <w:rtl w:val="0"/>
+        </w:rPr>
+        <w:t xml:space="preserve">Insights</w:t>
+      </w:r>
+    </w:p>
+    <w:p>
+      <w:pPr>
+        <w:rPr/>
+      </w:pPr>
+      <w:r>
+        <w:rPr>
+          <w:rtl w:val="0"/>
+        </w:rPr>
+        <w:t xml:space="preserve">There is a down-turn in most of the features around 2020, due to the COVID-19 recession. Consumer Price Index steadily increases except for minor decreases at the end of every year. Long-term interest rates and earnings, including P/E over the last 10 years, are somewhat erratic. This could indicate market volatility or responses to economic events (e.g. fed reserve dropping interest rates during a recession). The interest rates and earnings are an opportunity for further analysis.  </w:t>
+      </w:r>
+    </w:p>
+    <w:p>
+      <w:pPr>
+        <w:pStyle w:val="Heading1"/>
+        <w:rPr/>
+      </w:pPr>
+      <w:bookmarkStart w:colFirst="0" w:colLast="0" w:name="_veuzkv78pm18" w:id="3"/>
+      <w:bookmarkEnd w:id="3"/>
+      <w:r>
+        <w:rPr>
+          <w:rtl w:val="0"/>
+        </w:rPr>
         <w:t xml:space="preserve">Challenges</w:t>
       </w:r>
     </w:p>
@@ -102,8 +141,8 @@
         <w:pStyle w:val="Heading1"/>
         <w:rPr/>
       </w:pPr>
-      <w:bookmarkStart w:colFirst="0" w:colLast="0" w:name="_mgr737175equ" w:id="2"/>
-      <w:bookmarkEnd w:id="2"/>
+      <w:bookmarkStart w:colFirst="0" w:colLast="0" w:name="_mgr737175equ" w:id="4"/>
+      <w:bookmarkEnd w:id="4"/>
       <w:r>
         <w:rPr>
           <w:rtl w:val="0"/>
@@ -225,16 +264,6 @@
           <w:t xml:space="preserve">https://stackoverflow.com/questions/59701153/how-to-iterate-over-two-arrays-in-parallel</w:t>
         </w:r>
       </w:hyperlink>
-      <w:r>
-        <w:rPr>
-          <w:rtl w:val="0"/>
-        </w:rPr>
-      </w:r>
-    </w:p>
-    <w:p>
-      <w:pPr>
-        <w:rPr/>
-      </w:pPr>
       <w:r>
         <w:rPr>
           <w:rtl w:val="0"/>

</xml_diff>